<commit_message>
Meraki 2026-04-30 daily pull: uplink statuses, config snapshots, monthly reports (7 orgs)
AOC, ARND, BWH, GSC, ORX, Technijian, VAF, VG config snapshots + uplink statuses
refreshed; 2026-01 through 2026-04 monthly DOCX reports regenerated for all orgs
with updated _brand.py and proofread_docx.py.

Co-Authored-By: Claude Sonnet 4.6 <noreply@anthropic.com>
</commit_message>
<xml_diff>
--- a/clients/aoc/meraki/reports/AOC - Meraki Monthly Activity - 2026-01.docx
+++ b/clients/aoc/meraki/reports/AOC - Meraki Monthly Activity - 2026-01.docx
@@ -95,7 +95,7 @@
       <w:tr>
         <w:tc>
           <w:tcPr>
-            <w:tcW w:type="dxa" w:w="3744"/>
+            <w:tcW w:type="dxa" w:w="3528"/>
             <w:tcBorders>
               <w:top w:val="nil"/>
               <w:left w:val="nil"/>
@@ -133,7 +133,7 @@
         </w:tc>
         <w:tc>
           <w:tcPr>
-            <w:tcW w:type="dxa" w:w="3744"/>
+            <w:tcW w:type="dxa" w:w="3528"/>
             <w:tcBorders>
               <w:top w:val="nil"/>
               <w:left w:val="nil"/>
@@ -319,15 +319,16 @@
         <w:tblLook w:firstColumn="1" w:firstRow="1" w:lastColumn="0" w:lastRow="0" w:noHBand="0" w:noVBand="1" w:val="04A0"/>
       </w:tblPr>
       <w:tblGrid>
-        <w:gridCol w:w="2340"/>
-        <w:gridCol w:w="2340"/>
-        <w:gridCol w:w="2340"/>
-        <w:gridCol w:w="2340"/>
+        <w:gridCol w:w="1872"/>
+        <w:gridCol w:w="1872"/>
+        <w:gridCol w:w="1872"/>
+        <w:gridCol w:w="1872"/>
+        <w:gridCol w:w="1872"/>
       </w:tblGrid>
       <w:tr>
         <w:tc>
           <w:tcPr>
-            <w:tcW w:type="dxa" w:w="2340"/>
+            <w:tcW w:type="dxa" w:w="1872"/>
             <w:shd w:val="clear" w:color="auto" w:fill="F8F9FA"/>
             <w:tcBorders>
               <w:top w:val="nil"/>
@@ -373,7 +374,7 @@
         </w:tc>
         <w:tc>
           <w:tcPr>
-            <w:tcW w:type="dxa" w:w="2340"/>
+            <w:tcW w:type="dxa" w:w="1872"/>
             <w:shd w:val="clear" w:color="auto" w:fill="F8F9FA"/>
             <w:tcBorders>
               <w:top w:val="nil"/>
@@ -419,7 +420,7 @@
         </w:tc>
         <w:tc>
           <w:tcPr>
-            <w:tcW w:type="dxa" w:w="2340"/>
+            <w:tcW w:type="dxa" w:w="1872"/>
             <w:shd w:val="clear" w:color="auto" w:fill="F8F9FA"/>
             <w:tcBorders>
               <w:top w:val="nil"/>
@@ -465,7 +466,7 @@
         </w:tc>
         <w:tc>
           <w:tcPr>
-            <w:tcW w:type="dxa" w:w="2340"/>
+            <w:tcW w:type="dxa" w:w="1872"/>
             <w:shd w:val="clear" w:color="auto" w:fill="F8F9FA"/>
             <w:tcBorders>
               <w:top w:val="nil"/>
@@ -506,6 +507,52 @@
                 <w:sz w:val="20"/>
               </w:rPr>
               <w:t>Activity events</w:t>
+            </w:r>
+          </w:p>
+        </w:tc>
+        <w:tc>
+          <w:tcPr>
+            <w:tcW w:type="dxa" w:w="1872"/>
+            <w:shd w:val="clear" w:color="auto" w:fill="F8F9FA"/>
+            <w:tcBorders>
+              <w:top w:val="nil"/>
+              <w:left w:val="nil"/>
+              <w:bottom w:val="nil"/>
+              <w:right w:val="nil"/>
+              <w:insideH w:val="nil"/>
+              <w:insideV w:val="nil"/>
+            </w:tcBorders>
+          </w:tcPr>
+          <w:p>
+            <w:pPr>
+              <w:spacing w:before="240" w:after="0"/>
+              <w:jc w:val="center"/>
+            </w:pPr>
+            <w:r>
+              <w:rPr>
+                <w:rFonts w:ascii="Open Sans" w:hAnsi="Open Sans"/>
+                <w:b/>
+                <w:i w:val="0"/>
+                <w:color w:val="28A745"/>
+                <w:sz w:val="48"/>
+              </w:rPr>
+              <w:t>0</w:t>
+            </w:r>
+          </w:p>
+          <w:p>
+            <w:pPr>
+              <w:spacing w:before="0" w:after="240"/>
+              <w:jc w:val="center"/>
+            </w:pPr>
+            <w:r>
+              <w:rPr>
+                <w:rFonts w:ascii="Open Sans" w:hAnsi="Open Sans"/>
+                <w:b w:val="0"/>
+                <w:i w:val="0"/>
+                <w:color w:val="59595B"/>
+                <w:sz w:val="20"/>
+              </w:rPr>
+              <w:t>Config changes</w:t>
             </w:r>
           </w:p>
         </w:tc>
@@ -632,7 +679,7 @@
           <w:color w:val="59595B"/>
           <w:sz w:val="22"/>
         </w:rPr>
-        <w:t>Devices by model:</w:t>
+        <w:t>Device inventory:</w:t>
       </w:r>
     </w:p>
     <w:tbl>
@@ -642,13 +689,72 @@
         <w:tblLook w:firstColumn="1" w:firstRow="1" w:lastColumn="0" w:lastRow="0" w:noHBand="0" w:noVBand="1" w:val="04A0"/>
       </w:tblPr>
       <w:tblGrid>
-        <w:gridCol w:w="4680"/>
-        <w:gridCol w:w="4680"/>
+        <w:gridCol w:w="1337"/>
+        <w:gridCol w:w="1337"/>
+        <w:gridCol w:w="1337"/>
+        <w:gridCol w:w="1337"/>
+        <w:gridCol w:w="1337"/>
+        <w:gridCol w:w="1337"/>
+        <w:gridCol w:w="1337"/>
       </w:tblGrid>
       <w:tr>
         <w:tc>
           <w:tcPr>
-            <w:tcW w:type="dxa" w:w="5040"/>
+            <w:tcW w:type="dxa" w:w="1728"/>
+            <w:shd w:val="clear" w:color="auto" w:fill="006DB6"/>
+            <w:tcBorders>
+              <w:top w:val="single" w:sz="4" w:color="E9ECEF"/>
+              <w:left w:val="single" w:sz="4" w:color="E9ECEF"/>
+              <w:bottom w:val="single" w:sz="4" w:color="E9ECEF"/>
+              <w:right w:val="single" w:sz="4" w:color="E9ECEF"/>
+            </w:tcBorders>
+          </w:tcPr>
+          <w:p>
+            <w:pPr>
+              <w:spacing w:before="40" w:after="40"/>
+            </w:pPr>
+            <w:r>
+              <w:rPr>
+                <w:rFonts w:ascii="Open Sans" w:hAnsi="Open Sans"/>
+                <w:b/>
+                <w:i w:val="0"/>
+                <w:color w:val="FFFFFF"/>
+                <w:sz w:val="20"/>
+              </w:rPr>
+              <w:t>Device</w:t>
+            </w:r>
+          </w:p>
+        </w:tc>
+        <w:tc>
+          <w:tcPr>
+            <w:tcW w:type="dxa" w:w="1152"/>
+            <w:shd w:val="clear" w:color="auto" w:fill="006DB6"/>
+            <w:tcBorders>
+              <w:top w:val="single" w:sz="4" w:color="E9ECEF"/>
+              <w:left w:val="single" w:sz="4" w:color="E9ECEF"/>
+              <w:bottom w:val="single" w:sz="4" w:color="E9ECEF"/>
+              <w:right w:val="single" w:sz="4" w:color="E9ECEF"/>
+            </w:tcBorders>
+          </w:tcPr>
+          <w:p>
+            <w:pPr>
+              <w:spacing w:before="40" w:after="40"/>
+            </w:pPr>
+            <w:r>
+              <w:rPr>
+                <w:rFonts w:ascii="Open Sans" w:hAnsi="Open Sans"/>
+                <w:b/>
+                <w:i w:val="0"/>
+                <w:color w:val="FFFFFF"/>
+                <w:sz w:val="20"/>
+              </w:rPr>
+              <w:t>Network</w:t>
+            </w:r>
+          </w:p>
+        </w:tc>
+        <w:tc>
+          <w:tcPr>
+            <w:tcW w:type="dxa" w:w="1152"/>
             <w:shd w:val="clear" w:color="auto" w:fill="006DB6"/>
             <w:tcBorders>
               <w:top w:val="single" w:sz="4" w:color="E9ECEF"/>
@@ -675,7 +781,7 @@
         </w:tc>
         <w:tc>
           <w:tcPr>
-            <w:tcW w:type="dxa" w:w="2160"/>
+            <w:tcW w:type="dxa" w:w="1440"/>
             <w:shd w:val="clear" w:color="auto" w:fill="006DB6"/>
             <w:tcBorders>
               <w:top w:val="single" w:sz="4" w:color="E9ECEF"/>
@@ -696,7 +802,88 @@
                 <w:color w:val="FFFFFF"/>
                 <w:sz w:val="20"/>
               </w:rPr>
-              <w:t>Count</w:t>
+              <w:t>Serial</w:t>
+            </w:r>
+          </w:p>
+        </w:tc>
+        <w:tc>
+          <w:tcPr>
+            <w:tcW w:type="dxa" w:w="1440"/>
+            <w:shd w:val="clear" w:color="auto" w:fill="006DB6"/>
+            <w:tcBorders>
+              <w:top w:val="single" w:sz="4" w:color="E9ECEF"/>
+              <w:left w:val="single" w:sz="4" w:color="E9ECEF"/>
+              <w:bottom w:val="single" w:sz="4" w:color="E9ECEF"/>
+              <w:right w:val="single" w:sz="4" w:color="E9ECEF"/>
+            </w:tcBorders>
+          </w:tcPr>
+          <w:p>
+            <w:pPr>
+              <w:spacing w:before="40" w:after="40"/>
+            </w:pPr>
+            <w:r>
+              <w:rPr>
+                <w:rFonts w:ascii="Open Sans" w:hAnsi="Open Sans"/>
+                <w:b/>
+                <w:i w:val="0"/>
+                <w:color w:val="FFFFFF"/>
+                <w:sz w:val="20"/>
+              </w:rPr>
+              <w:t>Firmware</w:t>
+            </w:r>
+          </w:p>
+        </w:tc>
+        <w:tc>
+          <w:tcPr>
+            <w:tcW w:type="dxa" w:w="1296"/>
+            <w:shd w:val="clear" w:color="auto" w:fill="006DB6"/>
+            <w:tcBorders>
+              <w:top w:val="single" w:sz="4" w:color="E9ECEF"/>
+              <w:left w:val="single" w:sz="4" w:color="E9ECEF"/>
+              <w:bottom w:val="single" w:sz="4" w:color="E9ECEF"/>
+              <w:right w:val="single" w:sz="4" w:color="E9ECEF"/>
+            </w:tcBorders>
+          </w:tcPr>
+          <w:p>
+            <w:pPr>
+              <w:spacing w:before="40" w:after="40"/>
+            </w:pPr>
+            <w:r>
+              <w:rPr>
+                <w:rFonts w:ascii="Open Sans" w:hAnsi="Open Sans"/>
+                <w:b/>
+                <w:i w:val="0"/>
+                <w:color w:val="FFFFFF"/>
+                <w:sz w:val="20"/>
+              </w:rPr>
+              <w:t>LAN IP</w:t>
+            </w:r>
+          </w:p>
+        </w:tc>
+        <w:tc>
+          <w:tcPr>
+            <w:tcW w:type="dxa" w:w="1152"/>
+            <w:shd w:val="clear" w:color="auto" w:fill="006DB6"/>
+            <w:tcBorders>
+              <w:top w:val="single" w:sz="4" w:color="E9ECEF"/>
+              <w:left w:val="single" w:sz="4" w:color="E9ECEF"/>
+              <w:bottom w:val="single" w:sz="4" w:color="E9ECEF"/>
+              <w:right w:val="single" w:sz="4" w:color="E9ECEF"/>
+            </w:tcBorders>
+          </w:tcPr>
+          <w:p>
+            <w:pPr>
+              <w:spacing w:before="40" w:after="40"/>
+            </w:pPr>
+            <w:r>
+              <w:rPr>
+                <w:rFonts w:ascii="Open Sans" w:hAnsi="Open Sans"/>
+                <w:b/>
+                <w:i w:val="0"/>
+                <w:color w:val="FFFFFF"/>
+                <w:sz w:val="20"/>
+              </w:rPr>
+              <w:t>Type</w:t>
             </w:r>
           </w:p>
         </w:tc>
@@ -704,7 +891,59 @@
       <w:tr>
         <w:tc>
           <w:tcPr>
-            <w:tcW w:type="dxa" w:w="5040"/>
+            <w:tcW w:type="dxa" w:w="1728"/>
+            <w:tcBorders>
+              <w:top w:val="single" w:sz="4" w:color="E9ECEF"/>
+              <w:left w:val="single" w:sz="4" w:color="E9ECEF"/>
+              <w:bottom w:val="single" w:sz="4" w:color="E9ECEF"/>
+              <w:right w:val="single" w:sz="4" w:color="E9ECEF"/>
+            </w:tcBorders>
+          </w:tcPr>
+          <w:p>
+            <w:pPr>
+              <w:spacing w:before="40" w:after="40"/>
+            </w:pPr>
+            <w:r>
+              <w:rPr>
+                <w:rFonts w:ascii="Open Sans" w:hAnsi="Open Sans"/>
+                <w:b w:val="0"/>
+                <w:i w:val="0"/>
+                <w:color w:val="59595B"/>
+                <w:sz w:val="19"/>
+              </w:rPr>
+              <w:t>AAOC-AP-01</w:t>
+            </w:r>
+          </w:p>
+        </w:tc>
+        <w:tc>
+          <w:tcPr>
+            <w:tcW w:type="dxa" w:w="1152"/>
+            <w:tcBorders>
+              <w:top w:val="single" w:sz="4" w:color="E9ECEF"/>
+              <w:left w:val="single" w:sz="4" w:color="E9ECEF"/>
+              <w:bottom w:val="single" w:sz="4" w:color="E9ECEF"/>
+              <w:right w:val="single" w:sz="4" w:color="E9ECEF"/>
+            </w:tcBorders>
+          </w:tcPr>
+          <w:p>
+            <w:pPr>
+              <w:spacing w:before="40" w:after="40"/>
+            </w:pPr>
+            <w:r>
+              <w:rPr>
+                <w:rFonts w:ascii="Open Sans" w:hAnsi="Open Sans"/>
+                <w:b w:val="0"/>
+                <w:i w:val="0"/>
+                <w:color w:val="59595B"/>
+                <w:sz w:val="19"/>
+              </w:rPr>
+              <w:t>AOC-HQ</w:t>
+            </w:r>
+          </w:p>
+        </w:tc>
+        <w:tc>
+          <w:tcPr>
+            <w:tcW w:type="dxa" w:w="1152"/>
             <w:tcBorders>
               <w:top w:val="single" w:sz="4" w:color="E9ECEF"/>
               <w:left w:val="single" w:sz="4" w:color="E9ECEF"/>
@@ -730,7 +969,7 @@
         </w:tc>
         <w:tc>
           <w:tcPr>
-            <w:tcW w:type="dxa" w:w="2160"/>
+            <w:tcW w:type="dxa" w:w="1440"/>
             <w:tcBorders>
               <w:top w:val="single" w:sz="4" w:color="E9ECEF"/>
               <w:left w:val="single" w:sz="4" w:color="E9ECEF"/>
@@ -750,42 +989,13 @@
                 <w:color w:val="59595B"/>
                 <w:sz w:val="19"/>
               </w:rPr>
-              <w:t>1</w:t>
+              <w:t>Q3KA-3XSD-MC3U</w:t>
             </w:r>
           </w:p>
         </w:tc>
-      </w:tr>
-    </w:tbl>
-    <w:p>
-      <w:pPr>
-        <w:spacing w:after="160"/>
-      </w:pPr>
-      <w:r>
-        <w:rPr>
-          <w:rFonts w:ascii="Open Sans" w:hAnsi="Open Sans"/>
-          <w:b/>
-          <w:i w:val="0"/>
-          <w:color w:val="59595B"/>
-          <w:sz w:val="22"/>
-        </w:rPr>
-        <w:t>Devices by product type:</w:t>
-      </w:r>
-    </w:p>
-    <w:tbl>
-      <w:tblPr>
-        <w:tblW w:type="auto" w:w="0"/>
-        <w:tblLayout w:type="fixed"/>
-        <w:tblLook w:firstColumn="1" w:firstRow="1" w:lastColumn="0" w:lastRow="0" w:noHBand="0" w:noVBand="1" w:val="04A0"/>
-      </w:tblPr>
-      <w:tblGrid>
-        <w:gridCol w:w="4680"/>
-        <w:gridCol w:w="4680"/>
-      </w:tblGrid>
-      <w:tr>
         <w:tc>
           <w:tcPr>
-            <w:tcW w:type="dxa" w:w="5040"/>
-            <w:shd w:val="clear" w:color="auto" w:fill="006DB6"/>
+            <w:tcW w:type="dxa" w:w="1440"/>
             <w:tcBorders>
               <w:top w:val="single" w:sz="4" w:color="E9ECEF"/>
               <w:left w:val="single" w:sz="4" w:color="E9ECEF"/>
@@ -800,19 +1010,18 @@
             <w:r>
               <w:rPr>
                 <w:rFonts w:ascii="Open Sans" w:hAnsi="Open Sans"/>
-                <w:b/>
+                <w:b w:val="0"/>
                 <w:i w:val="0"/>
-                <w:color w:val="FFFFFF"/>
-                <w:sz w:val="20"/>
+                <w:color w:val="59595B"/>
+                <w:sz w:val="19"/>
               </w:rPr>
-              <w:t>Product type</w:t>
+              <w:t>wireless-31-1-7</w:t>
             </w:r>
           </w:p>
         </w:tc>
         <w:tc>
           <w:tcPr>
-            <w:tcW w:type="dxa" w:w="2160"/>
-            <w:shd w:val="clear" w:color="auto" w:fill="006DB6"/>
+            <w:tcW w:type="dxa" w:w="1296"/>
             <w:tcBorders>
               <w:top w:val="single" w:sz="4" w:color="E9ECEF"/>
               <w:left w:val="single" w:sz="4" w:color="E9ECEF"/>
@@ -827,20 +1036,18 @@
             <w:r>
               <w:rPr>
                 <w:rFonts w:ascii="Open Sans" w:hAnsi="Open Sans"/>
-                <w:b/>
+                <w:b w:val="0"/>
                 <w:i w:val="0"/>
-                <w:color w:val="FFFFFF"/>
-                <w:sz w:val="20"/>
+                <w:color w:val="59595B"/>
+                <w:sz w:val="19"/>
               </w:rPr>
-              <w:t>Count</w:t>
+              <w:t>10.1.1.106</w:t>
             </w:r>
           </w:p>
         </w:tc>
-      </w:tr>
-      <w:tr>
         <w:tc>
           <w:tcPr>
-            <w:tcW w:type="dxa" w:w="5040"/>
+            <w:tcW w:type="dxa" w:w="1152"/>
             <w:tcBorders>
               <w:top w:val="single" w:sz="4" w:color="E9ECEF"/>
               <w:left w:val="single" w:sz="4" w:color="E9ECEF"/>
@@ -861,32 +1068,6 @@
                 <w:sz w:val="19"/>
               </w:rPr>
               <w:t>wireless</w:t>
-            </w:r>
-          </w:p>
-        </w:tc>
-        <w:tc>
-          <w:tcPr>
-            <w:tcW w:type="dxa" w:w="2160"/>
-            <w:tcBorders>
-              <w:top w:val="single" w:sz="4" w:color="E9ECEF"/>
-              <w:left w:val="single" w:sz="4" w:color="E9ECEF"/>
-              <w:bottom w:val="single" w:sz="4" w:color="E9ECEF"/>
-              <w:right w:val="single" w:sz="4" w:color="E9ECEF"/>
-            </w:tcBorders>
-          </w:tcPr>
-          <w:p>
-            <w:pPr>
-              <w:spacing w:before="40" w:after="40"/>
-            </w:pPr>
-            <w:r>
-              <w:rPr>
-                <w:rFonts w:ascii="Open Sans" w:hAnsi="Open Sans"/>
-                <w:b w:val="0"/>
-                <w:i w:val="0"/>
-                <w:color w:val="59595B"/>
-                <w:sz w:val="19"/>
-              </w:rPr>
-              <w:t>1</w:t>
             </w:r>
           </w:p>
         </w:tc>
@@ -925,7 +1106,7 @@
       <w:tr>
         <w:tc>
           <w:tcPr>
-            <w:tcW w:type="dxa" w:w="2880"/>
+            <w:tcW w:type="dxa" w:w="2448"/>
             <w:shd w:val="clear" w:color="auto" w:fill="006DB6"/>
             <w:tcBorders>
               <w:top w:val="single" w:sz="4" w:color="E9ECEF"/>
@@ -952,7 +1133,7 @@
         </w:tc>
         <w:tc>
           <w:tcPr>
-            <w:tcW w:type="dxa" w:w="2304"/>
+            <w:tcW w:type="dxa" w:w="1872"/>
             <w:shd w:val="clear" w:color="auto" w:fill="006DB6"/>
             <w:tcBorders>
               <w:top w:val="single" w:sz="4" w:color="E9ECEF"/>
@@ -979,7 +1160,7 @@
         </w:tc>
         <w:tc>
           <w:tcPr>
-            <w:tcW w:type="dxa" w:w="1008"/>
+            <w:tcW w:type="dxa" w:w="864"/>
             <w:shd w:val="clear" w:color="auto" w:fill="006DB6"/>
             <w:tcBorders>
               <w:top w:val="single" w:sz="4" w:color="E9ECEF"/>
@@ -1006,7 +1187,7 @@
         </w:tc>
         <w:tc>
           <w:tcPr>
-            <w:tcW w:type="dxa" w:w="1152"/>
+            <w:tcW w:type="dxa" w:w="936"/>
             <w:shd w:val="clear" w:color="auto" w:fill="006DB6"/>
             <w:tcBorders>
               <w:top w:val="single" w:sz="4" w:color="E9ECEF"/>
@@ -1033,7 +1214,7 @@
         </w:tc>
         <w:tc>
           <w:tcPr>
-            <w:tcW w:type="dxa" w:w="1152"/>
+            <w:tcW w:type="dxa" w:w="936"/>
             <w:shd w:val="clear" w:color="auto" w:fill="006DB6"/>
             <w:tcBorders>
               <w:top w:val="single" w:sz="4" w:color="E9ECEF"/>
@@ -1060,7 +1241,7 @@
         </w:tc>
         <w:tc>
           <w:tcPr>
-            <w:tcW w:type="dxa" w:w="1152"/>
+            <w:tcW w:type="dxa" w:w="936"/>
             <w:shd w:val="clear" w:color="auto" w:fill="006DB6"/>
             <w:tcBorders>
               <w:top w:val="single" w:sz="4" w:color="E9ECEF"/>
@@ -1087,7 +1268,7 @@
         </w:tc>
         <w:tc>
           <w:tcPr>
-            <w:tcW w:type="dxa" w:w="1152"/>
+            <w:tcW w:type="dxa" w:w="936"/>
             <w:shd w:val="clear" w:color="auto" w:fill="006DB6"/>
             <w:tcBorders>
               <w:top w:val="single" w:sz="4" w:color="E9ECEF"/>
@@ -1116,7 +1297,7 @@
       <w:tr>
         <w:tc>
           <w:tcPr>
-            <w:tcW w:type="dxa" w:w="2880"/>
+            <w:tcW w:type="dxa" w:w="2448"/>
             <w:tcBorders>
               <w:top w:val="single" w:sz="4" w:color="E9ECEF"/>
               <w:left w:val="single" w:sz="4" w:color="E9ECEF"/>
@@ -1142,7 +1323,7 @@
         </w:tc>
         <w:tc>
           <w:tcPr>
-            <w:tcW w:type="dxa" w:w="2304"/>
+            <w:tcW w:type="dxa" w:w="1872"/>
             <w:tcBorders>
               <w:top w:val="single" w:sz="4" w:color="E9ECEF"/>
               <w:left w:val="single" w:sz="4" w:color="E9ECEF"/>
@@ -1168,7 +1349,7 @@
         </w:tc>
         <w:tc>
           <w:tcPr>
-            <w:tcW w:type="dxa" w:w="1008"/>
+            <w:tcW w:type="dxa" w:w="864"/>
             <w:tcBorders>
               <w:top w:val="single" w:sz="4" w:color="E9ECEF"/>
               <w:left w:val="single" w:sz="4" w:color="E9ECEF"/>
@@ -1194,7 +1375,7 @@
         </w:tc>
         <w:tc>
           <w:tcPr>
-            <w:tcW w:type="dxa" w:w="1152"/>
+            <w:tcW w:type="dxa" w:w="936"/>
             <w:tcBorders>
               <w:top w:val="single" w:sz="4" w:color="E9ECEF"/>
               <w:left w:val="single" w:sz="4" w:color="E9ECEF"/>
@@ -1220,7 +1401,7 @@
         </w:tc>
         <w:tc>
           <w:tcPr>
-            <w:tcW w:type="dxa" w:w="1152"/>
+            <w:tcW w:type="dxa" w:w="936"/>
             <w:tcBorders>
               <w:top w:val="single" w:sz="4" w:color="E9ECEF"/>
               <w:left w:val="single" w:sz="4" w:color="E9ECEF"/>
@@ -1246,7 +1427,7 @@
         </w:tc>
         <w:tc>
           <w:tcPr>
-            <w:tcW w:type="dxa" w:w="1152"/>
+            <w:tcW w:type="dxa" w:w="936"/>
             <w:tcBorders>
               <w:top w:val="single" w:sz="4" w:color="E9ECEF"/>
               <w:left w:val="single" w:sz="4" w:color="E9ECEF"/>
@@ -1272,7 +1453,7 @@
         </w:tc>
         <w:tc>
           <w:tcPr>
-            <w:tcW w:type="dxa" w:w="1152"/>
+            <w:tcW w:type="dxa" w:w="936"/>
             <w:tcBorders>
               <w:top w:val="single" w:sz="4" w:color="E9ECEF"/>
               <w:left w:val="single" w:sz="4" w:color="E9ECEF"/>
@@ -1293,6 +1474,961 @@
                 <w:sz w:val="19"/>
               </w:rPr>
               <w:t>0</w:t>
+            </w:r>
+          </w:p>
+        </w:tc>
+      </w:tr>
+    </w:tbl>
+    <w:tbl>
+      <w:tblPr>
+        <w:tblW w:type="auto" w:w="0"/>
+        <w:tblLayout w:type="fixed"/>
+        <w:tblLook w:firstColumn="1" w:firstRow="1" w:lastColumn="0" w:lastRow="0" w:noHBand="0" w:noVBand="1" w:val="04A0"/>
+      </w:tblPr>
+      <w:tblGrid>
+        <w:gridCol w:w="94"/>
+        <w:gridCol w:w="8976"/>
+      </w:tblGrid>
+      <w:tr>
+        <w:tc>
+          <w:tcPr>
+            <w:tcW w:type="dxa" w:w="94"/>
+            <w:shd w:val="clear" w:color="auto" w:fill="006DB6"/>
+            <w:tcBorders>
+              <w:top w:val="nil"/>
+              <w:left w:val="nil"/>
+              <w:bottom w:val="nil"/>
+              <w:right w:val="nil"/>
+              <w:insideH w:val="nil"/>
+              <w:insideV w:val="nil"/>
+            </w:tcBorders>
+          </w:tcPr>
+          <w:p/>
+        </w:tc>
+        <w:tc>
+          <w:tcPr>
+            <w:tcW w:type="dxa" w:w="8976"/>
+            <w:tcBorders>
+              <w:top w:val="nil"/>
+              <w:left w:val="nil"/>
+              <w:bottom w:val="nil"/>
+              <w:right w:val="nil"/>
+              <w:insideH w:val="nil"/>
+              <w:insideV w:val="nil"/>
+            </w:tcBorders>
+          </w:tcPr>
+          <w:p>
+            <w:pPr>
+              <w:spacing w:before="80" w:after="80"/>
+            </w:pPr>
+            <w:r>
+              <w:rPr>
+                <w:rFonts w:ascii="Open Sans" w:hAnsi="Open Sans"/>
+                <w:b/>
+                <w:i w:val="0"/>
+                <w:color w:val="006DB6"/>
+                <w:sz w:val="28"/>
+              </w:rPr>
+              <w:t xml:space="preserve">  Firewall Configuration</w:t>
+            </w:r>
+          </w:p>
+        </w:tc>
+      </w:tr>
+    </w:tbl>
+    <w:p>
+      <w:pPr>
+        <w:spacing w:after="160"/>
+      </w:pPr>
+      <w:r>
+        <w:rPr>
+          <w:rFonts w:ascii="Open Sans" w:hAnsi="Open Sans"/>
+          <w:b w:val="0"/>
+          <w:i w:val="0"/>
+          <w:color w:val="59595B"/>
+          <w:sz w:val="22"/>
+        </w:rPr>
+        <w:t>Full configuration snapshot of WAN interfaces, firewall rules, VLANs, port-forwarding, wireless SSIDs, and site-to-site VPN per network. Values reflect the most recent configuration pull.</w:t>
+      </w:r>
+    </w:p>
+    <w:p>
+      <w:pPr>
+        <w:spacing w:after="160"/>
+      </w:pPr>
+      <w:r>
+        <w:rPr>
+          <w:rFonts w:ascii="Open Sans" w:hAnsi="Open Sans"/>
+          <w:b/>
+          <w:i w:val="0"/>
+          <w:color w:val="59595B"/>
+          <w:sz w:val="22"/>
+        </w:rPr>
+        <w:t>AOC-HQ</w:t>
+      </w:r>
+    </w:p>
+    <w:p>
+      <w:pPr>
+        <w:spacing w:after="160"/>
+      </w:pPr>
+      <w:r>
+        <w:rPr>
+          <w:rFonts w:ascii="Open Sans" w:hAnsi="Open Sans"/>
+          <w:b w:val="0"/>
+          <w:i w:val="0"/>
+          <w:color w:val="59595B"/>
+          <w:sz w:val="22"/>
+        </w:rPr>
+        <w:t>L3 Outbound Firewall Rules:</w:t>
+      </w:r>
+    </w:p>
+    <w:tbl>
+      <w:tblPr>
+        <w:tblW w:type="auto" w:w="0"/>
+        <w:tblLayout w:type="fixed"/>
+        <w:tblLook w:firstColumn="1" w:firstRow="1" w:lastColumn="0" w:lastRow="0" w:noHBand="0" w:noVBand="1" w:val="04A0"/>
+      </w:tblPr>
+      <w:tblGrid>
+        <w:gridCol w:w="1872"/>
+        <w:gridCol w:w="1872"/>
+        <w:gridCol w:w="1872"/>
+        <w:gridCol w:w="1872"/>
+        <w:gridCol w:w="1872"/>
+      </w:tblGrid>
+      <w:tr>
+        <w:tc>
+          <w:tcPr>
+            <w:tcW w:type="dxa" w:w="864"/>
+            <w:shd w:val="clear" w:color="auto" w:fill="006DB6"/>
+            <w:tcBorders>
+              <w:top w:val="single" w:sz="4" w:color="E9ECEF"/>
+              <w:left w:val="single" w:sz="4" w:color="E9ECEF"/>
+              <w:bottom w:val="single" w:sz="4" w:color="E9ECEF"/>
+              <w:right w:val="single" w:sz="4" w:color="E9ECEF"/>
+            </w:tcBorders>
+          </w:tcPr>
+          <w:p>
+            <w:pPr>
+              <w:spacing w:before="40" w:after="40"/>
+            </w:pPr>
+            <w:r>
+              <w:rPr>
+                <w:rFonts w:ascii="Open Sans" w:hAnsi="Open Sans"/>
+                <w:b/>
+                <w:i w:val="0"/>
+                <w:color w:val="FFFFFF"/>
+                <w:sz w:val="20"/>
+              </w:rPr>
+              <w:t>Policy</w:t>
+            </w:r>
+          </w:p>
+        </w:tc>
+        <w:tc>
+          <w:tcPr>
+            <w:tcW w:type="dxa" w:w="936"/>
+            <w:shd w:val="clear" w:color="auto" w:fill="006DB6"/>
+            <w:tcBorders>
+              <w:top w:val="single" w:sz="4" w:color="E9ECEF"/>
+              <w:left w:val="single" w:sz="4" w:color="E9ECEF"/>
+              <w:bottom w:val="single" w:sz="4" w:color="E9ECEF"/>
+              <w:right w:val="single" w:sz="4" w:color="E9ECEF"/>
+            </w:tcBorders>
+          </w:tcPr>
+          <w:p>
+            <w:pPr>
+              <w:spacing w:before="40" w:after="40"/>
+            </w:pPr>
+            <w:r>
+              <w:rPr>
+                <w:rFonts w:ascii="Open Sans" w:hAnsi="Open Sans"/>
+                <w:b/>
+                <w:i w:val="0"/>
+                <w:color w:val="FFFFFF"/>
+                <w:sz w:val="20"/>
+              </w:rPr>
+              <w:t>Proto</w:t>
+            </w:r>
+          </w:p>
+        </w:tc>
+        <w:tc>
+          <w:tcPr>
+            <w:tcW w:type="dxa" w:w="2160"/>
+            <w:shd w:val="clear" w:color="auto" w:fill="006DB6"/>
+            <w:tcBorders>
+              <w:top w:val="single" w:sz="4" w:color="E9ECEF"/>
+              <w:left w:val="single" w:sz="4" w:color="E9ECEF"/>
+              <w:bottom w:val="single" w:sz="4" w:color="E9ECEF"/>
+              <w:right w:val="single" w:sz="4" w:color="E9ECEF"/>
+            </w:tcBorders>
+          </w:tcPr>
+          <w:p>
+            <w:pPr>
+              <w:spacing w:before="40" w:after="40"/>
+            </w:pPr>
+            <w:r>
+              <w:rPr>
+                <w:rFonts w:ascii="Open Sans" w:hAnsi="Open Sans"/>
+                <w:b/>
+                <w:i w:val="0"/>
+                <w:color w:val="FFFFFF"/>
+                <w:sz w:val="20"/>
+              </w:rPr>
+              <w:t>Source</w:t>
+            </w:r>
+          </w:p>
+        </w:tc>
+        <w:tc>
+          <w:tcPr>
+            <w:tcW w:type="dxa" w:w="2160"/>
+            <w:shd w:val="clear" w:color="auto" w:fill="006DB6"/>
+            <w:tcBorders>
+              <w:top w:val="single" w:sz="4" w:color="E9ECEF"/>
+              <w:left w:val="single" w:sz="4" w:color="E9ECEF"/>
+              <w:bottom w:val="single" w:sz="4" w:color="E9ECEF"/>
+              <w:right w:val="single" w:sz="4" w:color="E9ECEF"/>
+            </w:tcBorders>
+          </w:tcPr>
+          <w:p>
+            <w:pPr>
+              <w:spacing w:before="40" w:after="40"/>
+            </w:pPr>
+            <w:r>
+              <w:rPr>
+                <w:rFonts w:ascii="Open Sans" w:hAnsi="Open Sans"/>
+                <w:b/>
+                <w:i w:val="0"/>
+                <w:color w:val="FFFFFF"/>
+                <w:sz w:val="20"/>
+              </w:rPr>
+              <w:t>Destination</w:t>
+            </w:r>
+          </w:p>
+        </w:tc>
+        <w:tc>
+          <w:tcPr>
+            <w:tcW w:type="dxa" w:w="3168"/>
+            <w:shd w:val="clear" w:color="auto" w:fill="006DB6"/>
+            <w:tcBorders>
+              <w:top w:val="single" w:sz="4" w:color="E9ECEF"/>
+              <w:left w:val="single" w:sz="4" w:color="E9ECEF"/>
+              <w:bottom w:val="single" w:sz="4" w:color="E9ECEF"/>
+              <w:right w:val="single" w:sz="4" w:color="E9ECEF"/>
+            </w:tcBorders>
+          </w:tcPr>
+          <w:p>
+            <w:pPr>
+              <w:spacing w:before="40" w:after="40"/>
+            </w:pPr>
+            <w:r>
+              <w:rPr>
+                <w:rFonts w:ascii="Open Sans" w:hAnsi="Open Sans"/>
+                <w:b/>
+                <w:i w:val="0"/>
+                <w:color w:val="FFFFFF"/>
+                <w:sz w:val="20"/>
+              </w:rPr>
+              <w:t>Comment</w:t>
+            </w:r>
+          </w:p>
+        </w:tc>
+      </w:tr>
+      <w:tr>
+        <w:tc>
+          <w:tcPr>
+            <w:tcW w:type="dxa" w:w="864"/>
+            <w:tcBorders>
+              <w:top w:val="single" w:sz="4" w:color="E9ECEF"/>
+              <w:left w:val="single" w:sz="4" w:color="E9ECEF"/>
+              <w:bottom w:val="single" w:sz="4" w:color="E9ECEF"/>
+              <w:right w:val="single" w:sz="4" w:color="E9ECEF"/>
+            </w:tcBorders>
+          </w:tcPr>
+          <w:p>
+            <w:pPr>
+              <w:spacing w:before="40" w:after="40"/>
+            </w:pPr>
+            <w:r>
+              <w:rPr>
+                <w:rFonts w:ascii="Open Sans" w:hAnsi="Open Sans"/>
+                <w:b w:val="0"/>
+                <w:i w:val="0"/>
+                <w:color w:val="59595B"/>
+                <w:sz w:val="19"/>
+              </w:rPr>
+              <w:t>Allow</w:t>
+            </w:r>
+          </w:p>
+        </w:tc>
+        <w:tc>
+          <w:tcPr>
+            <w:tcW w:type="dxa" w:w="936"/>
+            <w:tcBorders>
+              <w:top w:val="single" w:sz="4" w:color="E9ECEF"/>
+              <w:left w:val="single" w:sz="4" w:color="E9ECEF"/>
+              <w:bottom w:val="single" w:sz="4" w:color="E9ECEF"/>
+              <w:right w:val="single" w:sz="4" w:color="E9ECEF"/>
+            </w:tcBorders>
+          </w:tcPr>
+          <w:p>
+            <w:pPr>
+              <w:spacing w:before="40" w:after="40"/>
+            </w:pPr>
+            <w:r>
+              <w:rPr>
+                <w:rFonts w:ascii="Open Sans" w:hAnsi="Open Sans"/>
+                <w:b w:val="0"/>
+                <w:i w:val="0"/>
+                <w:color w:val="59595B"/>
+                <w:sz w:val="19"/>
+              </w:rPr>
+              <w:t>ANY</w:t>
+            </w:r>
+          </w:p>
+        </w:tc>
+        <w:tc>
+          <w:tcPr>
+            <w:tcW w:type="dxa" w:w="2160"/>
+            <w:tcBorders>
+              <w:top w:val="single" w:sz="4" w:color="E9ECEF"/>
+              <w:left w:val="single" w:sz="4" w:color="E9ECEF"/>
+              <w:bottom w:val="single" w:sz="4" w:color="E9ECEF"/>
+              <w:right w:val="single" w:sz="4" w:color="E9ECEF"/>
+            </w:tcBorders>
+          </w:tcPr>
+          <w:p>
+            <w:pPr>
+              <w:spacing w:before="40" w:after="40"/>
+            </w:pPr>
+            <w:r>
+              <w:rPr>
+                <w:rFonts w:ascii="Open Sans" w:hAnsi="Open Sans"/>
+                <w:b w:val="0"/>
+                <w:i w:val="0"/>
+                <w:color w:val="59595B"/>
+                <w:sz w:val="19"/>
+              </w:rPr>
+              <w:t>Any</w:t>
+            </w:r>
+          </w:p>
+        </w:tc>
+        <w:tc>
+          <w:tcPr>
+            <w:tcW w:type="dxa" w:w="2160"/>
+            <w:tcBorders>
+              <w:top w:val="single" w:sz="4" w:color="E9ECEF"/>
+              <w:left w:val="single" w:sz="4" w:color="E9ECEF"/>
+              <w:bottom w:val="single" w:sz="4" w:color="E9ECEF"/>
+              <w:right w:val="single" w:sz="4" w:color="E9ECEF"/>
+            </w:tcBorders>
+          </w:tcPr>
+          <w:p>
+            <w:pPr>
+              <w:spacing w:before="40" w:after="40"/>
+            </w:pPr>
+            <w:r>
+              <w:rPr>
+                <w:rFonts w:ascii="Open Sans" w:hAnsi="Open Sans"/>
+                <w:b w:val="0"/>
+                <w:i w:val="0"/>
+                <w:color w:val="59595B"/>
+                <w:sz w:val="19"/>
+              </w:rPr>
+              <w:t>Any</w:t>
+            </w:r>
+          </w:p>
+        </w:tc>
+        <w:tc>
+          <w:tcPr>
+            <w:tcW w:type="dxa" w:w="3168"/>
+            <w:tcBorders>
+              <w:top w:val="single" w:sz="4" w:color="E9ECEF"/>
+              <w:left w:val="single" w:sz="4" w:color="E9ECEF"/>
+              <w:bottom w:val="single" w:sz="4" w:color="E9ECEF"/>
+              <w:right w:val="single" w:sz="4" w:color="E9ECEF"/>
+            </w:tcBorders>
+          </w:tcPr>
+          <w:p>
+            <w:pPr>
+              <w:spacing w:before="40" w:after="40"/>
+            </w:pPr>
+            <w:r>
+              <w:rPr>
+                <w:rFonts w:ascii="Open Sans" w:hAnsi="Open Sans"/>
+                <w:b w:val="0"/>
+                <w:i w:val="0"/>
+                <w:color w:val="59595B"/>
+                <w:sz w:val="19"/>
+              </w:rPr>
+              <w:t>Default rule</w:t>
+            </w:r>
+          </w:p>
+        </w:tc>
+      </w:tr>
+    </w:tbl>
+    <w:p>
+      <w:pPr>
+        <w:spacing w:after="160"/>
+      </w:pPr>
+      <w:r>
+        <w:rPr>
+          <w:rFonts w:ascii="Open Sans" w:hAnsi="Open Sans"/>
+          <w:b w:val="0"/>
+          <w:i w:val="0"/>
+          <w:color w:val="59595B"/>
+          <w:sz w:val="22"/>
+        </w:rPr>
+        <w:t>Inbound Firewall Rules:</w:t>
+      </w:r>
+    </w:p>
+    <w:tbl>
+      <w:tblPr>
+        <w:tblW w:type="auto" w:w="0"/>
+        <w:tblLayout w:type="fixed"/>
+        <w:tblLook w:firstColumn="1" w:firstRow="1" w:lastColumn="0" w:lastRow="0" w:noHBand="0" w:noVBand="1" w:val="04A0"/>
+      </w:tblPr>
+      <w:tblGrid>
+        <w:gridCol w:w="1872"/>
+        <w:gridCol w:w="1872"/>
+        <w:gridCol w:w="1872"/>
+        <w:gridCol w:w="1872"/>
+        <w:gridCol w:w="1872"/>
+      </w:tblGrid>
+      <w:tr>
+        <w:tc>
+          <w:tcPr>
+            <w:tcW w:type="dxa" w:w="864"/>
+            <w:shd w:val="clear" w:color="auto" w:fill="006DB6"/>
+            <w:tcBorders>
+              <w:top w:val="single" w:sz="4" w:color="E9ECEF"/>
+              <w:left w:val="single" w:sz="4" w:color="E9ECEF"/>
+              <w:bottom w:val="single" w:sz="4" w:color="E9ECEF"/>
+              <w:right w:val="single" w:sz="4" w:color="E9ECEF"/>
+            </w:tcBorders>
+          </w:tcPr>
+          <w:p>
+            <w:pPr>
+              <w:spacing w:before="40" w:after="40"/>
+            </w:pPr>
+            <w:r>
+              <w:rPr>
+                <w:rFonts w:ascii="Open Sans" w:hAnsi="Open Sans"/>
+                <w:b/>
+                <w:i w:val="0"/>
+                <w:color w:val="FFFFFF"/>
+                <w:sz w:val="20"/>
+              </w:rPr>
+              <w:t>Policy</w:t>
+            </w:r>
+          </w:p>
+        </w:tc>
+        <w:tc>
+          <w:tcPr>
+            <w:tcW w:type="dxa" w:w="936"/>
+            <w:shd w:val="clear" w:color="auto" w:fill="006DB6"/>
+            <w:tcBorders>
+              <w:top w:val="single" w:sz="4" w:color="E9ECEF"/>
+              <w:left w:val="single" w:sz="4" w:color="E9ECEF"/>
+              <w:bottom w:val="single" w:sz="4" w:color="E9ECEF"/>
+              <w:right w:val="single" w:sz="4" w:color="E9ECEF"/>
+            </w:tcBorders>
+          </w:tcPr>
+          <w:p>
+            <w:pPr>
+              <w:spacing w:before="40" w:after="40"/>
+            </w:pPr>
+            <w:r>
+              <w:rPr>
+                <w:rFonts w:ascii="Open Sans" w:hAnsi="Open Sans"/>
+                <w:b/>
+                <w:i w:val="0"/>
+                <w:color w:val="FFFFFF"/>
+                <w:sz w:val="20"/>
+              </w:rPr>
+              <w:t>Proto</w:t>
+            </w:r>
+          </w:p>
+        </w:tc>
+        <w:tc>
+          <w:tcPr>
+            <w:tcW w:type="dxa" w:w="2160"/>
+            <w:shd w:val="clear" w:color="auto" w:fill="006DB6"/>
+            <w:tcBorders>
+              <w:top w:val="single" w:sz="4" w:color="E9ECEF"/>
+              <w:left w:val="single" w:sz="4" w:color="E9ECEF"/>
+              <w:bottom w:val="single" w:sz="4" w:color="E9ECEF"/>
+              <w:right w:val="single" w:sz="4" w:color="E9ECEF"/>
+            </w:tcBorders>
+          </w:tcPr>
+          <w:p>
+            <w:pPr>
+              <w:spacing w:before="40" w:after="40"/>
+            </w:pPr>
+            <w:r>
+              <w:rPr>
+                <w:rFonts w:ascii="Open Sans" w:hAnsi="Open Sans"/>
+                <w:b/>
+                <w:i w:val="0"/>
+                <w:color w:val="FFFFFF"/>
+                <w:sz w:val="20"/>
+              </w:rPr>
+              <w:t>Source</w:t>
+            </w:r>
+          </w:p>
+        </w:tc>
+        <w:tc>
+          <w:tcPr>
+            <w:tcW w:type="dxa" w:w="2160"/>
+            <w:shd w:val="clear" w:color="auto" w:fill="006DB6"/>
+            <w:tcBorders>
+              <w:top w:val="single" w:sz="4" w:color="E9ECEF"/>
+              <w:left w:val="single" w:sz="4" w:color="E9ECEF"/>
+              <w:bottom w:val="single" w:sz="4" w:color="E9ECEF"/>
+              <w:right w:val="single" w:sz="4" w:color="E9ECEF"/>
+            </w:tcBorders>
+          </w:tcPr>
+          <w:p>
+            <w:pPr>
+              <w:spacing w:before="40" w:after="40"/>
+            </w:pPr>
+            <w:r>
+              <w:rPr>
+                <w:rFonts w:ascii="Open Sans" w:hAnsi="Open Sans"/>
+                <w:b/>
+                <w:i w:val="0"/>
+                <w:color w:val="FFFFFF"/>
+                <w:sz w:val="20"/>
+              </w:rPr>
+              <w:t>Destination</w:t>
+            </w:r>
+          </w:p>
+        </w:tc>
+        <w:tc>
+          <w:tcPr>
+            <w:tcW w:type="dxa" w:w="3168"/>
+            <w:shd w:val="clear" w:color="auto" w:fill="006DB6"/>
+            <w:tcBorders>
+              <w:top w:val="single" w:sz="4" w:color="E9ECEF"/>
+              <w:left w:val="single" w:sz="4" w:color="E9ECEF"/>
+              <w:bottom w:val="single" w:sz="4" w:color="E9ECEF"/>
+              <w:right w:val="single" w:sz="4" w:color="E9ECEF"/>
+            </w:tcBorders>
+          </w:tcPr>
+          <w:p>
+            <w:pPr>
+              <w:spacing w:before="40" w:after="40"/>
+            </w:pPr>
+            <w:r>
+              <w:rPr>
+                <w:rFonts w:ascii="Open Sans" w:hAnsi="Open Sans"/>
+                <w:b/>
+                <w:i w:val="0"/>
+                <w:color w:val="FFFFFF"/>
+                <w:sz w:val="20"/>
+              </w:rPr>
+              <w:t>Comment</w:t>
+            </w:r>
+          </w:p>
+        </w:tc>
+      </w:tr>
+      <w:tr>
+        <w:tc>
+          <w:tcPr>
+            <w:tcW w:type="dxa" w:w="864"/>
+            <w:tcBorders>
+              <w:top w:val="single" w:sz="4" w:color="E9ECEF"/>
+              <w:left w:val="single" w:sz="4" w:color="E9ECEF"/>
+              <w:bottom w:val="single" w:sz="4" w:color="E9ECEF"/>
+              <w:right w:val="single" w:sz="4" w:color="E9ECEF"/>
+            </w:tcBorders>
+          </w:tcPr>
+          <w:p>
+            <w:pPr>
+              <w:spacing w:before="40" w:after="40"/>
+            </w:pPr>
+            <w:r>
+              <w:rPr>
+                <w:rFonts w:ascii="Open Sans" w:hAnsi="Open Sans"/>
+                <w:b w:val="0"/>
+                <w:i w:val="0"/>
+                <w:color w:val="59595B"/>
+                <w:sz w:val="19"/>
+              </w:rPr>
+              <w:t>Deny</w:t>
+            </w:r>
+          </w:p>
+        </w:tc>
+        <w:tc>
+          <w:tcPr>
+            <w:tcW w:type="dxa" w:w="936"/>
+            <w:tcBorders>
+              <w:top w:val="single" w:sz="4" w:color="E9ECEF"/>
+              <w:left w:val="single" w:sz="4" w:color="E9ECEF"/>
+              <w:bottom w:val="single" w:sz="4" w:color="E9ECEF"/>
+              <w:right w:val="single" w:sz="4" w:color="E9ECEF"/>
+            </w:tcBorders>
+          </w:tcPr>
+          <w:p>
+            <w:pPr>
+              <w:spacing w:before="40" w:after="40"/>
+            </w:pPr>
+            <w:r>
+              <w:rPr>
+                <w:rFonts w:ascii="Open Sans" w:hAnsi="Open Sans"/>
+                <w:b w:val="0"/>
+                <w:i w:val="0"/>
+                <w:color w:val="59595B"/>
+                <w:sz w:val="19"/>
+              </w:rPr>
+              <w:t>ANY</w:t>
+            </w:r>
+          </w:p>
+        </w:tc>
+        <w:tc>
+          <w:tcPr>
+            <w:tcW w:type="dxa" w:w="2160"/>
+            <w:tcBorders>
+              <w:top w:val="single" w:sz="4" w:color="E9ECEF"/>
+              <w:left w:val="single" w:sz="4" w:color="E9ECEF"/>
+              <w:bottom w:val="single" w:sz="4" w:color="E9ECEF"/>
+              <w:right w:val="single" w:sz="4" w:color="E9ECEF"/>
+            </w:tcBorders>
+          </w:tcPr>
+          <w:p>
+            <w:pPr>
+              <w:spacing w:before="40" w:after="40"/>
+            </w:pPr>
+            <w:r>
+              <w:rPr>
+                <w:rFonts w:ascii="Open Sans" w:hAnsi="Open Sans"/>
+                <w:b w:val="0"/>
+                <w:i w:val="0"/>
+                <w:color w:val="59595B"/>
+                <w:sz w:val="19"/>
+              </w:rPr>
+              <w:t>Any</w:t>
+            </w:r>
+          </w:p>
+        </w:tc>
+        <w:tc>
+          <w:tcPr>
+            <w:tcW w:type="dxa" w:w="2160"/>
+            <w:tcBorders>
+              <w:top w:val="single" w:sz="4" w:color="E9ECEF"/>
+              <w:left w:val="single" w:sz="4" w:color="E9ECEF"/>
+              <w:bottom w:val="single" w:sz="4" w:color="E9ECEF"/>
+              <w:right w:val="single" w:sz="4" w:color="E9ECEF"/>
+            </w:tcBorders>
+          </w:tcPr>
+          <w:p>
+            <w:pPr>
+              <w:spacing w:before="40" w:after="40"/>
+            </w:pPr>
+            <w:r>
+              <w:rPr>
+                <w:rFonts w:ascii="Open Sans" w:hAnsi="Open Sans"/>
+                <w:b w:val="0"/>
+                <w:i w:val="0"/>
+                <w:color w:val="59595B"/>
+                <w:sz w:val="19"/>
+              </w:rPr>
+              <w:t>Any</w:t>
+            </w:r>
+          </w:p>
+        </w:tc>
+        <w:tc>
+          <w:tcPr>
+            <w:tcW w:type="dxa" w:w="3168"/>
+            <w:tcBorders>
+              <w:top w:val="single" w:sz="4" w:color="E9ECEF"/>
+              <w:left w:val="single" w:sz="4" w:color="E9ECEF"/>
+              <w:bottom w:val="single" w:sz="4" w:color="E9ECEF"/>
+              <w:right w:val="single" w:sz="4" w:color="E9ECEF"/>
+            </w:tcBorders>
+          </w:tcPr>
+          <w:p>
+            <w:pPr>
+              <w:spacing w:before="40" w:after="40"/>
+            </w:pPr>
+            <w:r>
+              <w:rPr>
+                <w:rFonts w:ascii="Open Sans" w:hAnsi="Open Sans"/>
+                <w:b w:val="0"/>
+                <w:i w:val="0"/>
+                <w:color w:val="59595B"/>
+                <w:sz w:val="19"/>
+              </w:rPr>
+              <w:t>Default rule</w:t>
+            </w:r>
+          </w:p>
+        </w:tc>
+      </w:tr>
+    </w:tbl>
+    <w:p>
+      <w:pPr>
+        <w:spacing w:after="160"/>
+      </w:pPr>
+      <w:r>
+        <w:rPr>
+          <w:rFonts w:ascii="Open Sans" w:hAnsi="Open Sans"/>
+          <w:b w:val="0"/>
+          <w:i w:val="0"/>
+          <w:color w:val="59595B"/>
+          <w:sz w:val="22"/>
+        </w:rPr>
+        <w:t>Wireless SSIDs (enabled):</w:t>
+      </w:r>
+    </w:p>
+    <w:tbl>
+      <w:tblPr>
+        <w:tblW w:type="auto" w:w="0"/>
+        <w:tblLayout w:type="fixed"/>
+        <w:tblLook w:firstColumn="1" w:firstRow="1" w:lastColumn="0" w:lastRow="0" w:noHBand="0" w:noVBand="1" w:val="04A0"/>
+      </w:tblPr>
+      <w:tblGrid>
+        <w:gridCol w:w="3120"/>
+        <w:gridCol w:w="3120"/>
+        <w:gridCol w:w="3120"/>
+      </w:tblGrid>
+      <w:tr>
+        <w:tc>
+          <w:tcPr>
+            <w:tcW w:type="dxa" w:w="576"/>
+            <w:shd w:val="clear" w:color="auto" w:fill="006DB6"/>
+            <w:tcBorders>
+              <w:top w:val="single" w:sz="4" w:color="E9ECEF"/>
+              <w:left w:val="single" w:sz="4" w:color="E9ECEF"/>
+              <w:bottom w:val="single" w:sz="4" w:color="E9ECEF"/>
+              <w:right w:val="single" w:sz="4" w:color="E9ECEF"/>
+            </w:tcBorders>
+          </w:tcPr>
+          <w:p>
+            <w:pPr>
+              <w:spacing w:before="40" w:after="40"/>
+            </w:pPr>
+            <w:r>
+              <w:rPr>
+                <w:rFonts w:ascii="Open Sans" w:hAnsi="Open Sans"/>
+                <w:b/>
+                <w:i w:val="0"/>
+                <w:color w:val="FFFFFF"/>
+                <w:sz w:val="20"/>
+              </w:rPr>
+              <w:t>#</w:t>
+            </w:r>
+          </w:p>
+        </w:tc>
+        <w:tc>
+          <w:tcPr>
+            <w:tcW w:type="dxa" w:w="4320"/>
+            <w:shd w:val="clear" w:color="auto" w:fill="006DB6"/>
+            <w:tcBorders>
+              <w:top w:val="single" w:sz="4" w:color="E9ECEF"/>
+              <w:left w:val="single" w:sz="4" w:color="E9ECEF"/>
+              <w:bottom w:val="single" w:sz="4" w:color="E9ECEF"/>
+              <w:right w:val="single" w:sz="4" w:color="E9ECEF"/>
+            </w:tcBorders>
+          </w:tcPr>
+          <w:p>
+            <w:pPr>
+              <w:spacing w:before="40" w:after="40"/>
+            </w:pPr>
+            <w:r>
+              <w:rPr>
+                <w:rFonts w:ascii="Open Sans" w:hAnsi="Open Sans"/>
+                <w:b/>
+                <w:i w:val="0"/>
+                <w:color w:val="FFFFFF"/>
+                <w:sz w:val="20"/>
+              </w:rPr>
+              <w:t>SSID Name</w:t>
+            </w:r>
+          </w:p>
+        </w:tc>
+        <w:tc>
+          <w:tcPr>
+            <w:tcW w:type="dxa" w:w="2880"/>
+            <w:shd w:val="clear" w:color="auto" w:fill="006DB6"/>
+            <w:tcBorders>
+              <w:top w:val="single" w:sz="4" w:color="E9ECEF"/>
+              <w:left w:val="single" w:sz="4" w:color="E9ECEF"/>
+              <w:bottom w:val="single" w:sz="4" w:color="E9ECEF"/>
+              <w:right w:val="single" w:sz="4" w:color="E9ECEF"/>
+            </w:tcBorders>
+          </w:tcPr>
+          <w:p>
+            <w:pPr>
+              <w:spacing w:before="40" w:after="40"/>
+            </w:pPr>
+            <w:r>
+              <w:rPr>
+                <w:rFonts w:ascii="Open Sans" w:hAnsi="Open Sans"/>
+                <w:b/>
+                <w:i w:val="0"/>
+                <w:color w:val="FFFFFF"/>
+                <w:sz w:val="20"/>
+              </w:rPr>
+              <w:t>Auth Mode</w:t>
+            </w:r>
+          </w:p>
+        </w:tc>
+      </w:tr>
+      <w:tr>
+        <w:tc>
+          <w:tcPr>
+            <w:tcW w:type="dxa" w:w="576"/>
+            <w:tcBorders>
+              <w:top w:val="single" w:sz="4" w:color="E9ECEF"/>
+              <w:left w:val="single" w:sz="4" w:color="E9ECEF"/>
+              <w:bottom w:val="single" w:sz="4" w:color="E9ECEF"/>
+              <w:right w:val="single" w:sz="4" w:color="E9ECEF"/>
+            </w:tcBorders>
+          </w:tcPr>
+          <w:p>
+            <w:pPr>
+              <w:spacing w:before="40" w:after="40"/>
+            </w:pPr>
+            <w:r>
+              <w:rPr>
+                <w:rFonts w:ascii="Open Sans" w:hAnsi="Open Sans"/>
+                <w:b w:val="0"/>
+                <w:i w:val="0"/>
+                <w:color w:val="59595B"/>
+                <w:sz w:val="19"/>
+              </w:rPr>
+              <w:t>—</w:t>
+            </w:r>
+          </w:p>
+        </w:tc>
+        <w:tc>
+          <w:tcPr>
+            <w:tcW w:type="dxa" w:w="4320"/>
+            <w:tcBorders>
+              <w:top w:val="single" w:sz="4" w:color="E9ECEF"/>
+              <w:left w:val="single" w:sz="4" w:color="E9ECEF"/>
+              <w:bottom w:val="single" w:sz="4" w:color="E9ECEF"/>
+              <w:right w:val="single" w:sz="4" w:color="E9ECEF"/>
+            </w:tcBorders>
+          </w:tcPr>
+          <w:p>
+            <w:pPr>
+              <w:spacing w:before="40" w:after="40"/>
+            </w:pPr>
+            <w:r>
+              <w:rPr>
+                <w:rFonts w:ascii="Open Sans" w:hAnsi="Open Sans"/>
+                <w:b w:val="0"/>
+                <w:i w:val="0"/>
+                <w:color w:val="59595B"/>
+                <w:sz w:val="19"/>
+              </w:rPr>
+              <w:t>AAOC(secure)</w:t>
+            </w:r>
+          </w:p>
+        </w:tc>
+        <w:tc>
+          <w:tcPr>
+            <w:tcW w:type="dxa" w:w="2880"/>
+            <w:tcBorders>
+              <w:top w:val="single" w:sz="4" w:color="E9ECEF"/>
+              <w:left w:val="single" w:sz="4" w:color="E9ECEF"/>
+              <w:bottom w:val="single" w:sz="4" w:color="E9ECEF"/>
+              <w:right w:val="single" w:sz="4" w:color="E9ECEF"/>
+            </w:tcBorders>
+          </w:tcPr>
+          <w:p>
+            <w:pPr>
+              <w:spacing w:before="40" w:after="40"/>
+            </w:pPr>
+            <w:r>
+              <w:rPr>
+                <w:rFonts w:ascii="Open Sans" w:hAnsi="Open Sans"/>
+                <w:b w:val="0"/>
+                <w:i w:val="0"/>
+                <w:color w:val="59595B"/>
+                <w:sz w:val="19"/>
+              </w:rPr>
+              <w:t>PSK</w:t>
+            </w:r>
+          </w:p>
+        </w:tc>
+      </w:tr>
+      <w:tr>
+        <w:tc>
+          <w:tcPr>
+            <w:tcW w:type="dxa" w:w="576"/>
+            <w:shd w:val="clear" w:color="auto" w:fill="F8F9FA"/>
+            <w:tcBorders>
+              <w:top w:val="single" w:sz="4" w:color="E9ECEF"/>
+              <w:left w:val="single" w:sz="4" w:color="E9ECEF"/>
+              <w:bottom w:val="single" w:sz="4" w:color="E9ECEF"/>
+              <w:right w:val="single" w:sz="4" w:color="E9ECEF"/>
+            </w:tcBorders>
+          </w:tcPr>
+          <w:p>
+            <w:pPr>
+              <w:spacing w:before="40" w:after="40"/>
+            </w:pPr>
+            <w:r>
+              <w:rPr>
+                <w:rFonts w:ascii="Open Sans" w:hAnsi="Open Sans"/>
+                <w:b w:val="0"/>
+                <w:i w:val="0"/>
+                <w:color w:val="59595B"/>
+                <w:sz w:val="19"/>
+              </w:rPr>
+              <w:t>1</w:t>
+            </w:r>
+          </w:p>
+        </w:tc>
+        <w:tc>
+          <w:tcPr>
+            <w:tcW w:type="dxa" w:w="4320"/>
+            <w:shd w:val="clear" w:color="auto" w:fill="F8F9FA"/>
+            <w:tcBorders>
+              <w:top w:val="single" w:sz="4" w:color="E9ECEF"/>
+              <w:left w:val="single" w:sz="4" w:color="E9ECEF"/>
+              <w:bottom w:val="single" w:sz="4" w:color="E9ECEF"/>
+              <w:right w:val="single" w:sz="4" w:color="E9ECEF"/>
+            </w:tcBorders>
+          </w:tcPr>
+          <w:p>
+            <w:pPr>
+              <w:spacing w:before="40" w:after="40"/>
+            </w:pPr>
+            <w:r>
+              <w:rPr>
+                <w:rFonts w:ascii="Open Sans" w:hAnsi="Open Sans"/>
+                <w:b w:val="0"/>
+                <w:i w:val="0"/>
+                <w:color w:val="59595B"/>
+                <w:sz w:val="19"/>
+              </w:rPr>
+              <w:t>AAOC(guest)</w:t>
+            </w:r>
+          </w:p>
+        </w:tc>
+        <w:tc>
+          <w:tcPr>
+            <w:tcW w:type="dxa" w:w="2880"/>
+            <w:shd w:val="clear" w:color="auto" w:fill="F8F9FA"/>
+            <w:tcBorders>
+              <w:top w:val="single" w:sz="4" w:color="E9ECEF"/>
+              <w:left w:val="single" w:sz="4" w:color="E9ECEF"/>
+              <w:bottom w:val="single" w:sz="4" w:color="E9ECEF"/>
+              <w:right w:val="single" w:sz="4" w:color="E9ECEF"/>
+            </w:tcBorders>
+          </w:tcPr>
+          <w:p>
+            <w:pPr>
+              <w:spacing w:before="40" w:after="40"/>
+            </w:pPr>
+            <w:r>
+              <w:rPr>
+                <w:rFonts w:ascii="Open Sans" w:hAnsi="Open Sans"/>
+                <w:b w:val="0"/>
+                <w:i w:val="0"/>
+                <w:color w:val="59595B"/>
+                <w:sz w:val="19"/>
+              </w:rPr>
+              <w:t>PSK</w:t>
             </w:r>
           </w:p>
         </w:tc>
@@ -1387,7 +2523,7 @@
       <w:tr>
         <w:tc>
           <w:tcPr>
-            <w:tcW w:type="dxa" w:w="2592"/>
+            <w:tcW w:type="dxa" w:w="2160"/>
             <w:shd w:val="clear" w:color="auto" w:fill="006DB6"/>
             <w:tcBorders>
               <w:top w:val="single" w:sz="4" w:color="E9ECEF"/>
@@ -1414,7 +2550,7 @@
         </w:tc>
         <w:tc>
           <w:tcPr>
-            <w:tcW w:type="dxa" w:w="1440"/>
+            <w:tcW w:type="dxa" w:w="1296"/>
             <w:shd w:val="clear" w:color="auto" w:fill="006DB6"/>
             <w:tcBorders>
               <w:top w:val="single" w:sz="4" w:color="E9ECEF"/>
@@ -1441,7 +2577,7 @@
         </w:tc>
         <w:tc>
           <w:tcPr>
-            <w:tcW w:type="dxa" w:w="1152"/>
+            <w:tcW w:type="dxa" w:w="1080"/>
             <w:shd w:val="clear" w:color="auto" w:fill="006DB6"/>
             <w:tcBorders>
               <w:top w:val="single" w:sz="4" w:color="E9ECEF"/>
@@ -1468,7 +2604,7 @@
         </w:tc>
         <w:tc>
           <w:tcPr>
-            <w:tcW w:type="dxa" w:w="1296"/>
+            <w:tcW w:type="dxa" w:w="1224"/>
             <w:shd w:val="clear" w:color="auto" w:fill="006DB6"/>
             <w:tcBorders>
               <w:top w:val="single" w:sz="4" w:color="E9ECEF"/>
@@ -1495,7 +2631,7 @@
         </w:tc>
         <w:tc>
           <w:tcPr>
-            <w:tcW w:type="dxa" w:w="1440"/>
+            <w:tcW w:type="dxa" w:w="1296"/>
             <w:shd w:val="clear" w:color="auto" w:fill="006DB6"/>
             <w:tcBorders>
               <w:top w:val="single" w:sz="4" w:color="E9ECEF"/>
@@ -1549,7 +2685,7 @@
         </w:tc>
         <w:tc>
           <w:tcPr>
-            <w:tcW w:type="dxa" w:w="1008"/>
+            <w:tcW w:type="dxa" w:w="936"/>
             <w:shd w:val="clear" w:color="auto" w:fill="006DB6"/>
             <w:tcBorders>
               <w:top w:val="single" w:sz="4" w:color="E9ECEF"/>
@@ -1578,7 +2714,7 @@
       <w:tr>
         <w:tc>
           <w:tcPr>
-            <w:tcW w:type="dxa" w:w="2592"/>
+            <w:tcW w:type="dxa" w:w="2160"/>
             <w:tcBorders>
               <w:top w:val="single" w:sz="4" w:color="E9ECEF"/>
               <w:left w:val="single" w:sz="4" w:color="E9ECEF"/>
@@ -1604,7 +2740,7 @@
         </w:tc>
         <w:tc>
           <w:tcPr>
-            <w:tcW w:type="dxa" w:w="1440"/>
+            <w:tcW w:type="dxa" w:w="1296"/>
             <w:tcBorders>
               <w:top w:val="single" w:sz="4" w:color="E9ECEF"/>
               <w:left w:val="single" w:sz="4" w:color="E9ECEF"/>
@@ -1630,7 +2766,7 @@
         </w:tc>
         <w:tc>
           <w:tcPr>
-            <w:tcW w:type="dxa" w:w="1152"/>
+            <w:tcW w:type="dxa" w:w="1080"/>
             <w:tcBorders>
               <w:top w:val="single" w:sz="4" w:color="E9ECEF"/>
               <w:left w:val="single" w:sz="4" w:color="E9ECEF"/>
@@ -1656,7 +2792,7 @@
         </w:tc>
         <w:tc>
           <w:tcPr>
-            <w:tcW w:type="dxa" w:w="1296"/>
+            <w:tcW w:type="dxa" w:w="1224"/>
             <w:tcBorders>
               <w:top w:val="single" w:sz="4" w:color="E9ECEF"/>
               <w:left w:val="single" w:sz="4" w:color="E9ECEF"/>
@@ -1682,7 +2818,7 @@
         </w:tc>
         <w:tc>
           <w:tcPr>
-            <w:tcW w:type="dxa" w:w="1440"/>
+            <w:tcW w:type="dxa" w:w="1296"/>
             <w:tcBorders>
               <w:top w:val="single" w:sz="4" w:color="E9ECEF"/>
               <w:left w:val="single" w:sz="4" w:color="E9ECEF"/>
@@ -1734,7 +2870,7 @@
         </w:tc>
         <w:tc>
           <w:tcPr>
-            <w:tcW w:type="dxa" w:w="1008"/>
+            <w:tcW w:type="dxa" w:w="936"/>
             <w:tcBorders>
               <w:top w:val="single" w:sz="4" w:color="E9ECEF"/>
               <w:left w:val="single" w:sz="4" w:color="E9ECEF"/>
@@ -1755,6 +2891,252 @@
                 <w:sz w:val="19"/>
               </w:rPr>
               <w:t>0</w:t>
+            </w:r>
+          </w:p>
+        </w:tc>
+      </w:tr>
+    </w:tbl>
+    <w:tbl>
+      <w:tblPr>
+        <w:tblW w:type="auto" w:w="0"/>
+        <w:tblLayout w:type="fixed"/>
+        <w:tblLook w:firstColumn="1" w:firstRow="1" w:lastColumn="0" w:lastRow="0" w:noHBand="0" w:noVBand="1" w:val="04A0"/>
+      </w:tblPr>
+      <w:tblGrid>
+        <w:gridCol w:w="94"/>
+        <w:gridCol w:w="8976"/>
+      </w:tblGrid>
+      <w:tr>
+        <w:tc>
+          <w:tcPr>
+            <w:tcW w:type="dxa" w:w="94"/>
+            <w:shd w:val="clear" w:color="auto" w:fill="006DB6"/>
+            <w:tcBorders>
+              <w:top w:val="nil"/>
+              <w:left w:val="nil"/>
+              <w:bottom w:val="nil"/>
+              <w:right w:val="nil"/>
+              <w:insideH w:val="nil"/>
+              <w:insideV w:val="nil"/>
+            </w:tcBorders>
+          </w:tcPr>
+          <w:p/>
+        </w:tc>
+        <w:tc>
+          <w:tcPr>
+            <w:tcW w:type="dxa" w:w="8976"/>
+            <w:tcBorders>
+              <w:top w:val="nil"/>
+              <w:left w:val="nil"/>
+              <w:bottom w:val="nil"/>
+              <w:right w:val="nil"/>
+              <w:insideH w:val="nil"/>
+              <w:insideV w:val="nil"/>
+            </w:tcBorders>
+          </w:tcPr>
+          <w:p>
+            <w:pPr>
+              <w:spacing w:before="80" w:after="80"/>
+            </w:pPr>
+            <w:r>
+              <w:rPr>
+                <w:rFonts w:ascii="Open Sans" w:hAnsi="Open Sans"/>
+                <w:b/>
+                <w:i w:val="0"/>
+                <w:color w:val="006DB6"/>
+                <w:sz w:val="28"/>
+              </w:rPr>
+              <w:t xml:space="preserve">  Configuration Changes</w:t>
+            </w:r>
+          </w:p>
+        </w:tc>
+      </w:tr>
+    </w:tbl>
+    <w:tbl>
+      <w:tblPr>
+        <w:tblW w:type="auto" w:w="0"/>
+        <w:tblLayout w:type="fixed"/>
+        <w:tblLook w:firstColumn="1" w:firstRow="1" w:lastColumn="0" w:lastRow="0" w:noHBand="0" w:noVBand="1" w:val="04A0"/>
+      </w:tblPr>
+      <w:tblGrid>
+        <w:gridCol w:w="3120"/>
+        <w:gridCol w:w="3120"/>
+        <w:gridCol w:w="3120"/>
+      </w:tblGrid>
+      <w:tr>
+        <w:tc>
+          <w:tcPr>
+            <w:tcW w:type="dxa" w:w="3120"/>
+            <w:shd w:val="clear" w:color="auto" w:fill="F8F9FA"/>
+            <w:tcBorders>
+              <w:top w:val="nil"/>
+              <w:left w:val="nil"/>
+              <w:bottom w:val="nil"/>
+              <w:right w:val="nil"/>
+              <w:insideH w:val="nil"/>
+              <w:insideV w:val="nil"/>
+            </w:tcBorders>
+          </w:tcPr>
+          <w:p>
+            <w:pPr>
+              <w:spacing w:before="240" w:after="0"/>
+              <w:jc w:val="center"/>
+            </w:pPr>
+            <w:r>
+              <w:rPr>
+                <w:rFonts w:ascii="Open Sans" w:hAnsi="Open Sans"/>
+                <w:b/>
+                <w:i w:val="0"/>
+                <w:color w:val="006DB6"/>
+                <w:sz w:val="48"/>
+              </w:rPr>
+              <w:t>0</w:t>
+            </w:r>
+          </w:p>
+          <w:p>
+            <w:pPr>
+              <w:spacing w:before="0" w:after="240"/>
+              <w:jc w:val="center"/>
+            </w:pPr>
+            <w:r>
+              <w:rPr>
+                <w:rFonts w:ascii="Open Sans" w:hAnsi="Open Sans"/>
+                <w:b w:val="0"/>
+                <w:i w:val="0"/>
+                <w:color w:val="59595B"/>
+                <w:sz w:val="20"/>
+              </w:rPr>
+              <w:t>Total changes</w:t>
+            </w:r>
+          </w:p>
+        </w:tc>
+        <w:tc>
+          <w:tcPr>
+            <w:tcW w:type="dxa" w:w="3120"/>
+            <w:shd w:val="clear" w:color="auto" w:fill="F8F9FA"/>
+            <w:tcBorders>
+              <w:top w:val="nil"/>
+              <w:left w:val="nil"/>
+              <w:bottom w:val="nil"/>
+              <w:right w:val="nil"/>
+              <w:insideH w:val="nil"/>
+              <w:insideV w:val="nil"/>
+            </w:tcBorders>
+          </w:tcPr>
+          <w:p>
+            <w:pPr>
+              <w:spacing w:before="240" w:after="0"/>
+              <w:jc w:val="center"/>
+            </w:pPr>
+            <w:r>
+              <w:rPr>
+                <w:rFonts w:ascii="Open Sans" w:hAnsi="Open Sans"/>
+                <w:b/>
+                <w:i w:val="0"/>
+                <w:color w:val="006DB6"/>
+                <w:sz w:val="48"/>
+              </w:rPr>
+              <w:t>0</w:t>
+            </w:r>
+          </w:p>
+          <w:p>
+            <w:pPr>
+              <w:spacing w:before="0" w:after="240"/>
+              <w:jc w:val="center"/>
+            </w:pPr>
+            <w:r>
+              <w:rPr>
+                <w:rFonts w:ascii="Open Sans" w:hAnsi="Open Sans"/>
+                <w:b w:val="0"/>
+                <w:i w:val="0"/>
+                <w:color w:val="59595B"/>
+                <w:sz w:val="20"/>
+              </w:rPr>
+              <w:t>Admins active</w:t>
+            </w:r>
+          </w:p>
+        </w:tc>
+        <w:tc>
+          <w:tcPr>
+            <w:tcW w:type="dxa" w:w="3120"/>
+            <w:shd w:val="clear" w:color="auto" w:fill="F8F9FA"/>
+            <w:tcBorders>
+              <w:top w:val="nil"/>
+              <w:left w:val="nil"/>
+              <w:bottom w:val="nil"/>
+              <w:right w:val="nil"/>
+              <w:insideH w:val="nil"/>
+              <w:insideV w:val="nil"/>
+            </w:tcBorders>
+          </w:tcPr>
+          <w:p>
+            <w:pPr>
+              <w:spacing w:before="240" w:after="0"/>
+              <w:jc w:val="center"/>
+            </w:pPr>
+            <w:r>
+              <w:rPr>
+                <w:rFonts w:ascii="Open Sans" w:hAnsi="Open Sans"/>
+                <w:b/>
+                <w:i w:val="0"/>
+                <w:color w:val="006DB6"/>
+                <w:sz w:val="48"/>
+              </w:rPr>
+              <w:t>0</w:t>
+            </w:r>
+          </w:p>
+          <w:p>
+            <w:pPr>
+              <w:spacing w:before="0" w:after="240"/>
+              <w:jc w:val="center"/>
+            </w:pPr>
+            <w:r>
+              <w:rPr>
+                <w:rFonts w:ascii="Open Sans" w:hAnsi="Open Sans"/>
+                <w:b w:val="0"/>
+                <w:i w:val="0"/>
+                <w:color w:val="59595B"/>
+                <w:sz w:val="20"/>
+              </w:rPr>
+              <w:t>Networks affected</w:t>
+            </w:r>
+          </w:p>
+        </w:tc>
+      </w:tr>
+    </w:tbl>
+    <w:tbl>
+      <w:tblPr>
+        <w:tblW w:type="auto" w:w="0"/>
+        <w:tblLook w:firstColumn="1" w:firstRow="1" w:lastColumn="0" w:lastRow="0" w:noHBand="0" w:noVBand="1" w:val="04A0"/>
+      </w:tblPr>
+      <w:tblGrid>
+        <w:gridCol w:w="9360"/>
+      </w:tblGrid>
+      <w:tr>
+        <w:tc>
+          <w:tcPr>
+            <w:tcW w:type="dxa" w:w="9360"/>
+            <w:shd w:val="clear" w:color="auto" w:fill="EAF7EE"/>
+            <w:tcBorders>
+              <w:top w:val="single" w:sz="12" w:color="28A745"/>
+              <w:left w:val="single" w:sz="12" w:color="28A745"/>
+              <w:bottom w:val="single" w:sz="12" w:color="28A745"/>
+              <w:right w:val="single" w:sz="12" w:color="28A745"/>
+            </w:tcBorders>
+          </w:tcPr>
+          <w:p>
+            <w:pPr>
+              <w:spacing w:before="120" w:after="120"/>
+            </w:pPr>
+            <w:r>
+              <w:rPr>
+                <w:rFonts w:ascii="Open Sans" w:hAnsi="Open Sans"/>
+                <w:b w:val="0"/>
+                <w:i w:val="0"/>
+                <w:color w:val="1A1A2E"/>
+                <w:sz w:val="22"/>
+              </w:rPr>
+              <w:t>No configuration changes were recorded via the Meraki Dashboard this month. The environment is stable and the documented baseline is intact.</w:t>
             </w:r>
           </w:p>
         </w:tc>
@@ -5038,7 +6420,7 @@
           <w:color w:val="59595B"/>
           <w:sz w:val="22"/>
         </w:rPr>
-        <w:t>Report generated 2026-04-29 17:33 for client code 'aoc'. Configuration snapshot taken 2026-04-29T21:36:25Z.</w:t>
+        <w:t>Report generated 2026-04-30 09:49 for client code 'aoc'. Configuration snapshot taken 2026-04-30T16:48:48Z.</w:t>
       </w:r>
     </w:p>
     <w:p>

</xml_diff>